<commit_message>
Update test and docs
</commit_message>
<xml_diff>
--- a/Projetos/02-Sistema-manutencao-rfid/projeto-02.docx
+++ b/Projetos/02-Sistema-manutencao-rfid/projeto-02.docx
@@ -435,41 +435,35 @@
         </w:numPr>
         <w:rPr>
           <w:rFonts w:ascii="Abadi" w:eastAsia="Abadi" w:hAnsi="Abadi" w:cs="Abadi"/>
-          <w:lang w:val="en-US"/>
-        </w:rPr>
-      </w:pPr>
-      <w:r>
-        <w:rPr>
-          <w:rFonts w:ascii="Abadi" w:eastAsia="Abadi" w:hAnsi="Abadi" w:cs="Abadi"/>
-          <w:lang w:val="en-US"/>
+        </w:rPr>
+      </w:pPr>
+      <w:r>
+        <w:rPr>
+          <w:rFonts w:ascii="Abadi" w:eastAsia="Abadi" w:hAnsi="Abadi" w:cs="Abadi"/>
         </w:rPr>
         <w:t xml:space="preserve">Google Account </w:t>
       </w:r>
       <w:r>
         <w:rPr>
           <w:rFonts w:ascii="Abadi" w:eastAsia="Abadi" w:hAnsi="Abadi" w:cs="Abadi"/>
-          <w:lang w:val="en-US"/>
         </w:rPr>
         <w:t xml:space="preserve">com </w:t>
       </w:r>
       <w:r>
         <w:rPr>
           <w:rFonts w:ascii="Abadi" w:eastAsia="Abadi" w:hAnsi="Abadi" w:cs="Abadi"/>
-          <w:lang w:val="en-US"/>
         </w:rPr>
         <w:t>configuração do Apps Script/Planilha</w:t>
       </w:r>
       <w:r>
         <w:rPr>
           <w:rFonts w:ascii="Abadi" w:eastAsia="Abadi" w:hAnsi="Abadi" w:cs="Abadi"/>
-          <w:lang w:val="en-US"/>
         </w:rPr>
         <w:t xml:space="preserve"> realizada</w:t>
       </w:r>
       <w:r>
         <w:rPr>
           <w:rFonts w:ascii="Abadi" w:eastAsia="Abadi" w:hAnsi="Abadi" w:cs="Abadi"/>
-          <w:lang w:val="en-US"/>
         </w:rPr>
         <w:t>.</w:t>
       </w:r>
@@ -1221,7 +1215,7 @@
         <w:rPr>
           <w:rFonts w:ascii="Abadi" w:eastAsia="Abadi" w:hAnsi="Abadi" w:cs="Abadi"/>
         </w:rPr>
-        <w:t>S3 Heltec V3</w:t>
+        <w:t xml:space="preserve">S3 </w:t>
       </w:r>
     </w:p>
     <w:p>
@@ -1451,7 +1445,7 @@
         <w:rPr>
           <w:rFonts w:ascii="Abadi" w:eastAsia="Abadi" w:hAnsi="Abadi" w:cs="Abadi"/>
         </w:rPr>
-        <w:t>O pino VEXT_CTRL (GPIO 18) deve ser colocado em nível ALTO (1) via software para que o display funcione. Sem isso, o display não receberá energia</w:t>
+        <w:t>O pino VEXT_CTRL deve ser colocado em nível ALTO (1) via software para que o display funcione. Sem isso, o display não receberá energia</w:t>
       </w:r>
       <w:r>
         <w:rPr>
@@ -1584,7 +1578,67 @@
         <w:rPr>
           <w:rFonts w:ascii="Abadi" w:eastAsia="Abadi" w:hAnsi="Abadi" w:cs="Abadi"/>
         </w:rPr>
-        <w:t>Conecte o RC522 à Heltec V3 conforme a pinagem definida no código: MISO (GPIO 11), MOSI (GPIO 10), SCK (GPIO 9) e SDA/CS (GPIO 8).</w:t>
+        <w:t xml:space="preserve">Conecte o RC522 </w:t>
+      </w:r>
+      <w:r>
+        <w:rPr>
+          <w:rFonts w:ascii="Abadi" w:eastAsia="Abadi" w:hAnsi="Abadi" w:cs="Abadi"/>
+        </w:rPr>
+        <w:t xml:space="preserve">ao ESP32-S3 </w:t>
+      </w:r>
+      <w:r>
+        <w:rPr>
+          <w:rFonts w:ascii="Abadi" w:eastAsia="Abadi" w:hAnsi="Abadi" w:cs="Abadi"/>
+        </w:rPr>
+        <w:t xml:space="preserve">conforme a pinagem definida no código: MISO (GPIO </w:t>
+      </w:r>
+      <w:r>
+        <w:rPr>
+          <w:rFonts w:ascii="Abadi" w:eastAsia="Abadi" w:hAnsi="Abadi" w:cs="Abadi"/>
+        </w:rPr>
+        <w:t>7</w:t>
+      </w:r>
+      <w:r>
+        <w:rPr>
+          <w:rFonts w:ascii="Abadi" w:eastAsia="Abadi" w:hAnsi="Abadi" w:cs="Abadi"/>
+        </w:rPr>
+        <w:t xml:space="preserve">), MOSI (GPIO </w:t>
+      </w:r>
+      <w:r>
+        <w:rPr>
+          <w:rFonts w:ascii="Abadi" w:eastAsia="Abadi" w:hAnsi="Abadi" w:cs="Abadi"/>
+        </w:rPr>
+        <w:t>6</w:t>
+      </w:r>
+      <w:r>
+        <w:rPr>
+          <w:rFonts w:ascii="Abadi" w:eastAsia="Abadi" w:hAnsi="Abadi" w:cs="Abadi"/>
+        </w:rPr>
+        <w:t xml:space="preserve">), SCK (GPIO </w:t>
+      </w:r>
+      <w:r>
+        <w:rPr>
+          <w:rFonts w:ascii="Abadi" w:eastAsia="Abadi" w:hAnsi="Abadi" w:cs="Abadi"/>
+        </w:rPr>
+        <w:t>5</w:t>
+      </w:r>
+      <w:r>
+        <w:rPr>
+          <w:rFonts w:ascii="Abadi" w:eastAsia="Abadi" w:hAnsi="Abadi" w:cs="Abadi"/>
+        </w:rPr>
+        <w:t xml:space="preserve">) e SDA (GPIO </w:t>
+      </w:r>
+      <w:r>
+        <w:rPr>
+          <w:rFonts w:ascii="Abadi" w:eastAsia="Abadi" w:hAnsi="Abadi" w:cs="Abadi"/>
+        </w:rPr>
+        <w:t>4</w:t>
+      </w:r>
+      <w:r>
+        <w:rPr>
+          <w:rFonts w:ascii="Abadi" w:eastAsia="Abadi" w:hAnsi="Abadi" w:cs="Abadi"/>
+        </w:rPr>
+        <w:t>).</w:t>
       </w:r>
     </w:p>
     <w:p>
@@ -1597,7 +1651,6 @@
         <w:spacing w:after="0"/>
         <w:rPr>
           <w:rFonts w:ascii="Abadi" w:eastAsia="Abadi" w:hAnsi="Abadi" w:cs="Abadi"/>
-          <w:highlight w:val="yellow"/>
         </w:rPr>
       </w:pPr>
       <w:r>
@@ -1605,7 +1658,6 @@
           <w:rFonts w:ascii="Abadi" w:eastAsia="Abadi" w:hAnsi="Abadi" w:cs="Abadi"/>
           <w:b/>
           <w:bCs/>
-          <w:highlight w:val="yellow"/>
         </w:rPr>
         <w:t>Referência Visual:</w:t>
       </w:r>
@@ -1613,22 +1665,69 @@
     <w:p>
       <w:pPr>
         <w:spacing w:after="0"/>
+        <w:ind w:left="360"/>
         <w:rPr>
           <w:rFonts w:ascii="Abadi" w:eastAsia="Abadi" w:hAnsi="Abadi" w:cs="Abadi"/>
           <w:highlight w:val="yellow"/>
         </w:rPr>
       </w:pPr>
-      <w:r>
-        <w:rPr>
-          <w:rFonts w:ascii="Abadi" w:eastAsia="Abadi" w:hAnsi="Abadi" w:cs="Abadi"/>
-          <w:highlight w:val="yellow"/>
-        </w:rPr>
-        <w:t>[Inserir Foto real da montagem ou Diagrama de fiação]</w:t>
-      </w:r>
     </w:p>
     <w:p>
       <w:pPr>
         <w:spacing w:after="0"/>
+        <w:ind w:left="360"/>
+        <w:jc w:val="center"/>
+        <w:rPr>
+          <w:rFonts w:ascii="Abadi" w:eastAsia="Abadi" w:hAnsi="Abadi" w:cs="Abadi"/>
+          <w:highlight w:val="yellow"/>
+        </w:rPr>
+      </w:pPr>
+      <w:r>
+        <w:rPr>
+          <w:rFonts w:eastAsia="Abadi"/>
+        </w:rPr>
+        <w:lastRenderedPageBreak/>
+        <w:drawing>
+          <wp:inline distT="0" distB="0" distL="0" distR="0" wp14:anchorId="1E8870E9" wp14:editId="73605888">
+            <wp:extent cx="5099312" cy="4229317"/>
+            <wp:effectExtent l="0" t="0" r="6350" b="0"/>
+            <wp:docPr id="1939631300" name="Picture 1"/>
+            <wp:cNvGraphicFramePr>
+              <a:graphicFrameLocks xmlns:a="http://schemas.openxmlformats.org/drawingml/2006/main" noChangeAspect="1"/>
+            </wp:cNvGraphicFramePr>
+            <a:graphic xmlns:a="http://schemas.openxmlformats.org/drawingml/2006/main">
+              <a:graphicData uri="http://schemas.openxmlformats.org/drawingml/2006/picture">
+                <pic:pic xmlns:pic="http://schemas.openxmlformats.org/drawingml/2006/picture">
+                  <pic:nvPicPr>
+                    <pic:cNvPr id="1939631300" name=""/>
+                    <pic:cNvPicPr/>
+                  </pic:nvPicPr>
+                  <pic:blipFill>
+                    <a:blip r:embed="rId11"/>
+                    <a:stretch>
+                      <a:fillRect/>
+                    </a:stretch>
+                  </pic:blipFill>
+                  <pic:spPr>
+                    <a:xfrm>
+                      <a:off x="0" y="0"/>
+                      <a:ext cx="5099312" cy="4229317"/>
+                    </a:xfrm>
+                    <a:prstGeom prst="rect">
+                      <a:avLst/>
+                    </a:prstGeom>
+                  </pic:spPr>
+                </pic:pic>
+              </a:graphicData>
+            </a:graphic>
+          </wp:inline>
+        </w:drawing>
+      </w:r>
+    </w:p>
+    <w:p>
+      <w:pPr>
+        <w:spacing w:after="0"/>
+        <w:jc w:val="center"/>
         <w:rPr>
           <w:rFonts w:ascii="Abadi" w:eastAsia="Abadi" w:hAnsi="Abadi" w:cs="Abadi"/>
         </w:rPr>
@@ -1638,9 +1737,8 @@
           <w:rFonts w:ascii="Abadi" w:eastAsia="Abadi" w:hAnsi="Abadi" w:cs="Abadi"/>
           <w:i/>
           <w:iCs/>
-          <w:highlight w:val="yellow"/>
-        </w:rPr>
-        <w:t>Legenda: [Descrição técnica do componente e sua respectiva conexão/pino.]</w:t>
+        </w:rPr>
+        <w:t>Esquematico da montagem.</w:t>
       </w:r>
     </w:p>
     <w:p>
@@ -1718,7 +1816,6 @@
           <w:b/>
           <w:bCs/>
         </w:rPr>
-        <w:lastRenderedPageBreak/>
         <w:t>Instrução:</w:t>
       </w:r>
       <w:r>
@@ -1738,13 +1835,265 @@
         <w:spacing w:after="0"/>
         <w:rPr>
           <w:rFonts w:ascii="Abadi" w:eastAsia="Abadi" w:hAnsi="Abadi" w:cs="Abadi"/>
-        </w:rPr>
-      </w:pPr>
-      <w:r>
-        <w:rPr>
-          <w:rFonts w:ascii="Abadi" w:eastAsia="Abadi" w:hAnsi="Abadi" w:cs="Abadi"/>
-        </w:rPr>
-        <w:t>Edite as constantes WIFI_SSID, WIFI_PASS e WEB_DEPLOY_URL com seus dados.</w:t>
+          <w:lang w:val="en-US"/>
+        </w:rPr>
+      </w:pPr>
+      <w:r>
+        <w:rPr>
+          <w:rFonts w:ascii="Abadi" w:eastAsia="Abadi" w:hAnsi="Abadi" w:cs="Abadi"/>
+          <w:lang w:val="en-US"/>
+        </w:rPr>
+        <w:t>Configure o Apps Script d</w:t>
+      </w:r>
+      <w:r>
+        <w:rPr>
+          <w:rFonts w:ascii="Abadi" w:eastAsia="Abadi" w:hAnsi="Abadi" w:cs="Abadi"/>
+          <w:lang w:val="en-US"/>
+        </w:rPr>
+        <w:t>o google sheet</w:t>
+      </w:r>
+    </w:p>
+    <w:p>
+      <w:pPr>
+        <w:pStyle w:val="ListParagraph"/>
+        <w:numPr>
+          <w:ilvl w:val="2"/>
+          <w:numId w:val="2"/>
+        </w:numPr>
+        <w:spacing w:after="0"/>
+        <w:rPr>
+          <w:rFonts w:ascii="Abadi" w:eastAsia="Abadi" w:hAnsi="Abadi" w:cs="Abadi"/>
+          <w:lang w:val="en-US"/>
+        </w:rPr>
+      </w:pPr>
+      <w:r>
+        <w:rPr>
+          <w:rFonts w:ascii="Abadi" w:eastAsia="Abadi" w:hAnsi="Abadi" w:cs="Abadi"/>
+          <w:lang w:val="en-US"/>
+        </w:rPr>
+        <w:t xml:space="preserve">Abra uma nova planilha </w:t>
+      </w:r>
+    </w:p>
+    <w:p>
+      <w:pPr>
+        <w:pStyle w:val="ListParagraph"/>
+        <w:numPr>
+          <w:ilvl w:val="2"/>
+          <w:numId w:val="2"/>
+        </w:numPr>
+        <w:spacing w:after="0"/>
+        <w:rPr>
+          <w:rFonts w:ascii="Abadi" w:eastAsia="Abadi" w:hAnsi="Abadi" w:cs="Abadi"/>
+        </w:rPr>
+      </w:pPr>
+      <w:r>
+        <w:rPr>
+          <w:rFonts w:ascii="Abadi" w:eastAsia="Abadi" w:hAnsi="Abadi" w:cs="Abadi"/>
+        </w:rPr>
+        <w:t xml:space="preserve">Va em </w:t>
+      </w:r>
+      <w:r>
+        <w:rPr>
+          <w:rFonts w:ascii="Abadi" w:eastAsia="Abadi" w:hAnsi="Abadi" w:cs="Abadi"/>
+        </w:rPr>
+        <w:t>Extensions -&gt; Apps S</w:t>
+      </w:r>
+      <w:r>
+        <w:rPr>
+          <w:rFonts w:ascii="Abadi" w:eastAsia="Abadi" w:hAnsi="Abadi" w:cs="Abadi"/>
+        </w:rPr>
+        <w:t xml:space="preserve">cript </w:t>
+      </w:r>
+    </w:p>
+    <w:p>
+      <w:pPr>
+        <w:pStyle w:val="ListParagraph"/>
+        <w:numPr>
+          <w:ilvl w:val="2"/>
+          <w:numId w:val="2"/>
+        </w:numPr>
+        <w:spacing w:after="0"/>
+        <w:rPr>
+          <w:rFonts w:ascii="Abadi" w:eastAsia="Abadi" w:hAnsi="Abadi" w:cs="Abadi"/>
+        </w:rPr>
+      </w:pPr>
+      <w:r>
+        <w:rPr>
+          <w:rFonts w:ascii="Abadi" w:eastAsia="Abadi" w:hAnsi="Abadi" w:cs="Abadi"/>
+        </w:rPr>
+        <w:t>Cole o código do arquivo “</w:t>
+      </w:r>
+      <w:r>
+        <w:rPr>
+          <w:rFonts w:ascii="Abadi" w:eastAsia="Abadi" w:hAnsi="Abadi" w:cs="Abadi"/>
+        </w:rPr>
+        <w:t>Apps_Script_Code</w:t>
+      </w:r>
+      <w:r>
+        <w:rPr>
+          <w:rFonts w:ascii="Abadi" w:eastAsia="Abadi" w:hAnsi="Abadi" w:cs="Abadi"/>
+        </w:rPr>
+        <w:t>”</w:t>
+      </w:r>
+    </w:p>
+    <w:p>
+      <w:pPr>
+        <w:pStyle w:val="ListParagraph"/>
+        <w:numPr>
+          <w:ilvl w:val="2"/>
+          <w:numId w:val="2"/>
+        </w:numPr>
+        <w:spacing w:after="0"/>
+        <w:rPr>
+          <w:rFonts w:ascii="Abadi" w:eastAsia="Abadi" w:hAnsi="Abadi" w:cs="Abadi"/>
+        </w:rPr>
+      </w:pPr>
+      <w:r>
+        <w:rPr>
+          <w:rFonts w:ascii="Abadi" w:eastAsia="Abadi" w:hAnsi="Abadi" w:cs="Abadi"/>
+        </w:rPr>
+        <w:t>Edite o sheet_id para o</w:t>
+      </w:r>
+      <w:r>
+        <w:rPr>
+          <w:rFonts w:ascii="Abadi" w:eastAsia="Abadi" w:hAnsi="Abadi" w:cs="Abadi"/>
+        </w:rPr>
+        <w:t xml:space="preserve"> seu ID</w:t>
+      </w:r>
+    </w:p>
+    <w:p>
+      <w:pPr>
+        <w:pStyle w:val="ListParagraph"/>
+        <w:numPr>
+          <w:ilvl w:val="3"/>
+          <w:numId w:val="2"/>
+        </w:numPr>
+        <w:spacing w:after="0"/>
+        <w:rPr>
+          <w:rFonts w:ascii="Abadi" w:eastAsia="Abadi" w:hAnsi="Abadi" w:cs="Abadi"/>
+        </w:rPr>
+      </w:pPr>
+      <w:r>
+        <w:rPr>
+          <w:rFonts w:ascii="Abadi" w:eastAsia="Abadi" w:hAnsi="Abadi" w:cs="Abadi"/>
+        </w:rPr>
+        <w:t xml:space="preserve">No link da sua planilha: </w:t>
+      </w:r>
+      <w:r>
+        <w:rPr>
+          <w:rFonts w:ascii="Abadi" w:eastAsia="Abadi" w:hAnsi="Abadi" w:cs="Abadi"/>
+        </w:rPr>
+        <w:t>https://docs.google.com/spreadsheets/d/</w:t>
+      </w:r>
+      <w:r>
+        <w:rPr>
+          <w:rFonts w:ascii="Abadi" w:eastAsia="Abadi" w:hAnsi="Abadi" w:cs="Abadi"/>
+        </w:rPr>
+        <w:t>”””seu</w:t>
+      </w:r>
+      <w:r>
+        <w:rPr>
+          <w:rFonts w:ascii="Abadi" w:eastAsia="Abadi" w:hAnsi="Abadi" w:cs="Abadi"/>
+        </w:rPr>
+        <w:t>_ID</w:t>
+      </w:r>
+      <w:r>
+        <w:rPr>
+          <w:rFonts w:ascii="Abadi" w:eastAsia="Abadi" w:hAnsi="Abadi" w:cs="Abadi"/>
+        </w:rPr>
+        <w:t>””””</w:t>
+      </w:r>
+      <w:r>
+        <w:rPr>
+          <w:rFonts w:ascii="Abadi" w:eastAsia="Abadi" w:hAnsi="Abadi" w:cs="Abadi"/>
+        </w:rPr>
+        <w:t>/</w:t>
+      </w:r>
+    </w:p>
+    <w:p>
+      <w:pPr>
+        <w:pStyle w:val="ListParagraph"/>
+        <w:numPr>
+          <w:ilvl w:val="2"/>
+          <w:numId w:val="2"/>
+        </w:numPr>
+        <w:spacing w:after="0"/>
+        <w:rPr>
+          <w:rFonts w:ascii="Abadi" w:eastAsia="Abadi" w:hAnsi="Abadi" w:cs="Abadi"/>
+        </w:rPr>
+      </w:pPr>
+      <w:r>
+        <w:rPr>
+          <w:rFonts w:ascii="Abadi" w:eastAsia="Abadi" w:hAnsi="Abadi" w:cs="Abadi"/>
+        </w:rPr>
+        <w:t xml:space="preserve">Faça o Deploy mantendo </w:t>
+      </w:r>
+    </w:p>
+    <w:p>
+      <w:pPr>
+        <w:pStyle w:val="ListParagraph"/>
+        <w:numPr>
+          <w:ilvl w:val="3"/>
+          <w:numId w:val="2"/>
+        </w:numPr>
+        <w:spacing w:after="0"/>
+        <w:rPr>
+          <w:rFonts w:ascii="Abadi" w:eastAsia="Abadi" w:hAnsi="Abadi" w:cs="Abadi"/>
+          <w:lang w:val="en-US"/>
+        </w:rPr>
+      </w:pPr>
+      <w:r>
+        <w:rPr>
+          <w:rFonts w:ascii="Abadi" w:eastAsia="Abadi" w:hAnsi="Abadi" w:cs="Abadi"/>
+          <w:lang w:val="en-US"/>
+        </w:rPr>
+        <w:t xml:space="preserve">Execute as: Me </w:t>
+      </w:r>
+    </w:p>
+    <w:p>
+      <w:pPr>
+        <w:pStyle w:val="ListParagraph"/>
+        <w:numPr>
+          <w:ilvl w:val="3"/>
+          <w:numId w:val="2"/>
+        </w:numPr>
+        <w:spacing w:after="0"/>
+        <w:rPr>
+          <w:rFonts w:ascii="Abadi" w:eastAsia="Abadi" w:hAnsi="Abadi" w:cs="Abadi"/>
+          <w:lang w:val="en-US"/>
+        </w:rPr>
+      </w:pPr>
+      <w:r>
+        <w:rPr>
+          <w:rFonts w:ascii="Abadi" w:eastAsia="Abadi" w:hAnsi="Abadi" w:cs="Abadi"/>
+          <w:lang w:val="en-US"/>
+        </w:rPr>
+        <w:t>Who has access: Anyone</w:t>
+      </w:r>
+    </w:p>
+    <w:p>
+      <w:pPr>
+        <w:pStyle w:val="ListParagraph"/>
+        <w:numPr>
+          <w:ilvl w:val="2"/>
+          <w:numId w:val="2"/>
+        </w:numPr>
+        <w:spacing w:after="0"/>
+        <w:rPr>
+          <w:rFonts w:ascii="Abadi" w:eastAsia="Abadi" w:hAnsi="Abadi" w:cs="Abadi"/>
+        </w:rPr>
+      </w:pPr>
+      <w:r>
+        <w:rPr>
+          <w:rFonts w:ascii="Abadi" w:eastAsia="Abadi" w:hAnsi="Abadi" w:cs="Abadi"/>
+        </w:rPr>
+        <w:t>Copie a URL do W</w:t>
+      </w:r>
+      <w:r>
+        <w:rPr>
+          <w:rFonts w:ascii="Abadi" w:eastAsia="Abadi" w:hAnsi="Abadi" w:cs="Abadi"/>
+        </w:rPr>
+        <w:t>eb app</w:t>
       </w:r>
     </w:p>
     <w:p>
@@ -1763,6 +2112,25 @@
         <w:rPr>
           <w:rFonts w:ascii="Abadi" w:eastAsia="Abadi" w:hAnsi="Abadi" w:cs="Abadi"/>
         </w:rPr>
+        <w:t>Edite as constantes WIFI_SSID, WIFI_PASS e WEB_DEPLOY_URL com seus dados.</w:t>
+      </w:r>
+    </w:p>
+    <w:p>
+      <w:pPr>
+        <w:pStyle w:val="ListParagraph"/>
+        <w:numPr>
+          <w:ilvl w:val="1"/>
+          <w:numId w:val="2"/>
+        </w:numPr>
+        <w:spacing w:after="0"/>
+        <w:rPr>
+          <w:rFonts w:ascii="Abadi" w:eastAsia="Abadi" w:hAnsi="Abadi" w:cs="Abadi"/>
+        </w:rPr>
+      </w:pPr>
+      <w:r>
+        <w:rPr>
+          <w:rFonts w:ascii="Abadi" w:eastAsia="Abadi" w:hAnsi="Abadi" w:cs="Abadi"/>
+        </w:rPr>
         <w:t>Realize o upload do código via VS Code</w:t>
       </w:r>
       <w:r>
@@ -1782,7 +2150,6 @@
         <w:spacing w:after="0"/>
         <w:rPr>
           <w:rFonts w:ascii="Abadi" w:eastAsia="Abadi" w:hAnsi="Abadi" w:cs="Abadi"/>
-          <w:highlight w:val="yellow"/>
         </w:rPr>
       </w:pPr>
       <w:r>
@@ -1790,43 +2157,385 @@
           <w:rFonts w:ascii="Abadi" w:eastAsia="Abadi" w:hAnsi="Abadi" w:cs="Abadi"/>
           <w:b/>
           <w:bCs/>
-          <w:highlight w:val="yellow"/>
-        </w:rPr>
+        </w:rPr>
+        <w:lastRenderedPageBreak/>
         <w:t>Referência Visual:</w:t>
       </w:r>
     </w:p>
     <w:p>
       <w:pPr>
+        <w:pStyle w:val="ListParagraph"/>
         <w:spacing w:after="0"/>
-        <w:rPr>
-          <w:rFonts w:ascii="Abadi" w:eastAsia="Abadi" w:hAnsi="Abadi" w:cs="Abadi"/>
-          <w:highlight w:val="yellow"/>
-        </w:rPr>
-      </w:pPr>
-      <w:r>
-        <w:rPr>
-          <w:rFonts w:ascii="Abadi" w:eastAsia="Abadi" w:hAnsi="Abadi" w:cs="Abadi"/>
-          <w:highlight w:val="yellow"/>
-        </w:rPr>
-        <w:t>[Inserir Screenshot da interface de upload ou foto do sistema energizado]</w:t>
+        <w:jc w:val="center"/>
+        <w:rPr>
+          <w:rFonts w:ascii="Abadi" w:eastAsia="Abadi" w:hAnsi="Abadi" w:cs="Abadi"/>
+        </w:rPr>
+      </w:pPr>
+      <w:r>
+        <w:rPr>
+          <w:rFonts w:ascii="Abadi" w:eastAsia="Abadi" w:hAnsi="Abadi" w:cs="Abadi"/>
+        </w:rPr>
+        <w:drawing>
+          <wp:inline distT="0" distB="0" distL="0" distR="0" wp14:anchorId="0A5B32AE" wp14:editId="29A317E8">
+            <wp:extent cx="4263242" cy="3065545"/>
+            <wp:effectExtent l="0" t="0" r="4445" b="1905"/>
+            <wp:docPr id="1549218501" name="Picture 1"/>
+            <wp:cNvGraphicFramePr>
+              <a:graphicFrameLocks xmlns:a="http://schemas.openxmlformats.org/drawingml/2006/main" noChangeAspect="1"/>
+            </wp:cNvGraphicFramePr>
+            <a:graphic xmlns:a="http://schemas.openxmlformats.org/drawingml/2006/main">
+              <a:graphicData uri="http://schemas.openxmlformats.org/drawingml/2006/picture">
+                <pic:pic xmlns:pic="http://schemas.openxmlformats.org/drawingml/2006/picture">
+                  <pic:nvPicPr>
+                    <pic:cNvPr id="1549218501" name=""/>
+                    <pic:cNvPicPr/>
+                  </pic:nvPicPr>
+                  <pic:blipFill>
+                    <a:blip r:embed="rId12"/>
+                    <a:stretch>
+                      <a:fillRect/>
+                    </a:stretch>
+                  </pic:blipFill>
+                  <pic:spPr>
+                    <a:xfrm>
+                      <a:off x="0" y="0"/>
+                      <a:ext cx="4270347" cy="3070654"/>
+                    </a:xfrm>
+                    <a:prstGeom prst="rect">
+                      <a:avLst/>
+                    </a:prstGeom>
+                  </pic:spPr>
+                </pic:pic>
+              </a:graphicData>
+            </a:graphic>
+          </wp:inline>
+        </w:drawing>
       </w:r>
     </w:p>
     <w:p>
       <w:pPr>
         <w:spacing w:after="0"/>
-        <w:rPr>
-          <w:rFonts w:ascii="Abadi" w:eastAsia="Abadi" w:hAnsi="Abadi" w:cs="Abadi"/>
-        </w:rPr>
-      </w:pPr>
-      <w:r>
+        <w:ind w:left="360"/>
+        <w:jc w:val="center"/>
         <w:rPr>
           <w:rFonts w:ascii="Abadi" w:eastAsia="Abadi" w:hAnsi="Abadi" w:cs="Abadi"/>
           <w:i/>
           <w:iCs/>
+        </w:rPr>
+      </w:pPr>
+      <w:r>
+        <w:rPr>
+          <w:rFonts w:ascii="Abadi" w:eastAsia="Abadi" w:hAnsi="Abadi" w:cs="Abadi"/>
+          <w:i/>
+          <w:iCs/>
+        </w:rPr>
+        <w:t>Configuraçães a serem realizadas</w:t>
+      </w:r>
+      <w:r>
+        <w:rPr>
+          <w:rFonts w:ascii="Abadi" w:eastAsia="Abadi" w:hAnsi="Abadi" w:cs="Abadi"/>
+          <w:i/>
+          <w:iCs/>
+        </w:rPr>
+        <w:t xml:space="preserve"> no </w:t>
+      </w:r>
+      <w:r>
+        <w:rPr>
+          <w:rFonts w:ascii="Abadi" w:eastAsia="Abadi" w:hAnsi="Abadi" w:cs="Abadi"/>
+          <w:i/>
+          <w:iCs/>
+        </w:rPr>
+        <w:t>Deploy</w:t>
+      </w:r>
+      <w:r>
+        <w:rPr>
+          <w:rFonts w:ascii="Abadi" w:eastAsia="Abadi" w:hAnsi="Abadi" w:cs="Abadi"/>
+          <w:i/>
+          <w:iCs/>
+        </w:rPr>
+        <w:t>.</w:t>
+      </w:r>
+    </w:p>
+    <w:p>
+      <w:pPr>
+        <w:pStyle w:val="ListParagraph"/>
+        <w:spacing w:after="0"/>
+        <w:jc w:val="center"/>
+        <w:rPr>
+          <w:rFonts w:ascii="Abadi" w:eastAsia="Abadi" w:hAnsi="Abadi" w:cs="Abadi"/>
+        </w:rPr>
+      </w:pPr>
+    </w:p>
+    <w:p>
+      <w:pPr>
+        <w:spacing w:after="0"/>
+        <w:ind w:left="360"/>
+        <w:jc w:val="center"/>
+        <w:rPr>
+          <w:rFonts w:ascii="Abadi" w:eastAsia="Abadi" w:hAnsi="Abadi" w:cs="Abadi"/>
+        </w:rPr>
+      </w:pPr>
+      <w:r>
+        <w:rPr>
+          <w:rFonts w:ascii="Abadi" w:eastAsia="Abadi" w:hAnsi="Abadi" w:cs="Abadi"/>
+        </w:rPr>
+        <w:drawing>
+          <wp:inline distT="0" distB="0" distL="0" distR="0" wp14:anchorId="7CE67493" wp14:editId="301325D6">
+            <wp:extent cx="4000706" cy="762039"/>
+            <wp:effectExtent l="0" t="0" r="0" b="0"/>
+            <wp:docPr id="1968048331" name="Picture 1"/>
+            <wp:cNvGraphicFramePr>
+              <a:graphicFrameLocks xmlns:a="http://schemas.openxmlformats.org/drawingml/2006/main" noChangeAspect="1"/>
+            </wp:cNvGraphicFramePr>
+            <a:graphic xmlns:a="http://schemas.openxmlformats.org/drawingml/2006/main">
+              <a:graphicData uri="http://schemas.openxmlformats.org/drawingml/2006/picture">
+                <pic:pic xmlns:pic="http://schemas.openxmlformats.org/drawingml/2006/picture">
+                  <pic:nvPicPr>
+                    <pic:cNvPr id="1968048331" name=""/>
+                    <pic:cNvPicPr/>
+                  </pic:nvPicPr>
+                  <pic:blipFill>
+                    <a:blip r:embed="rId13"/>
+                    <a:stretch>
+                      <a:fillRect/>
+                    </a:stretch>
+                  </pic:blipFill>
+                  <pic:spPr>
+                    <a:xfrm>
+                      <a:off x="0" y="0"/>
+                      <a:ext cx="4000706" cy="762039"/>
+                    </a:xfrm>
+                    <a:prstGeom prst="rect">
+                      <a:avLst/>
+                    </a:prstGeom>
+                  </pic:spPr>
+                </pic:pic>
+              </a:graphicData>
+            </a:graphic>
+          </wp:inline>
+        </w:drawing>
+      </w:r>
+    </w:p>
+    <w:p>
+      <w:pPr>
+        <w:spacing w:after="0"/>
+        <w:ind w:left="360"/>
+        <w:jc w:val="center"/>
+        <w:rPr>
+          <w:rFonts w:ascii="Abadi" w:eastAsia="Abadi" w:hAnsi="Abadi" w:cs="Abadi"/>
+          <w:i/>
+          <w:iCs/>
+        </w:rPr>
+      </w:pPr>
+      <w:r>
+        <w:rPr>
+          <w:rFonts w:ascii="Abadi" w:eastAsia="Abadi" w:hAnsi="Abadi" w:cs="Abadi"/>
+          <w:i/>
+          <w:iCs/>
+        </w:rPr>
+        <w:t>Configuraçães a serem realizadas</w:t>
+      </w:r>
+      <w:r>
+        <w:rPr>
+          <w:rFonts w:ascii="Abadi" w:eastAsia="Abadi" w:hAnsi="Abadi" w:cs="Abadi"/>
+          <w:i/>
+          <w:iCs/>
+        </w:rPr>
+        <w:t xml:space="preserve"> no código</w:t>
+      </w:r>
+      <w:r>
+        <w:rPr>
+          <w:rFonts w:ascii="Abadi" w:eastAsia="Abadi" w:hAnsi="Abadi" w:cs="Abadi"/>
+          <w:i/>
+          <w:iCs/>
+        </w:rPr>
+        <w:t>.</w:t>
+      </w:r>
+    </w:p>
+    <w:p>
+      <w:pPr>
+        <w:spacing w:after="0"/>
+        <w:ind w:left="360"/>
+        <w:jc w:val="center"/>
+        <w:rPr>
+          <w:rFonts w:ascii="Abadi" w:eastAsia="Abadi" w:hAnsi="Abadi" w:cs="Abadi"/>
+        </w:rPr>
+      </w:pPr>
+    </w:p>
+    <w:p>
+      <w:pPr>
+        <w:spacing w:after="0"/>
+        <w:ind w:left="360"/>
+        <w:jc w:val="center"/>
+        <w:rPr>
+          <w:rFonts w:ascii="Abadi" w:eastAsia="Abadi" w:hAnsi="Abadi" w:cs="Abadi"/>
+        </w:rPr>
+      </w:pPr>
+      <w:r>
+        <w:rPr>
+          <w:rFonts w:ascii="Abadi" w:eastAsia="Abadi" w:hAnsi="Abadi" w:cs="Abadi"/>
+        </w:rPr>
+        <w:drawing>
+          <wp:inline distT="0" distB="0" distL="0" distR="0" wp14:anchorId="60CE66D8" wp14:editId="3D7923E3">
+            <wp:extent cx="3922052" cy="970060"/>
+            <wp:effectExtent l="0" t="0" r="2540" b="1905"/>
+            <wp:docPr id="2111228494" name="Picture 1"/>
+            <wp:cNvGraphicFramePr>
+              <a:graphicFrameLocks xmlns:a="http://schemas.openxmlformats.org/drawingml/2006/main" noChangeAspect="1"/>
+            </wp:cNvGraphicFramePr>
+            <a:graphic xmlns:a="http://schemas.openxmlformats.org/drawingml/2006/main">
+              <a:graphicData uri="http://schemas.openxmlformats.org/drawingml/2006/picture">
+                <pic:pic xmlns:pic="http://schemas.openxmlformats.org/drawingml/2006/picture">
+                  <pic:nvPicPr>
+                    <pic:cNvPr id="2111228494" name=""/>
+                    <pic:cNvPicPr/>
+                  </pic:nvPicPr>
+                  <pic:blipFill>
+                    <a:blip r:embed="rId14"/>
+                    <a:stretch>
+                      <a:fillRect/>
+                    </a:stretch>
+                  </pic:blipFill>
+                  <pic:spPr>
+                    <a:xfrm>
+                      <a:off x="0" y="0"/>
+                      <a:ext cx="3938531" cy="974136"/>
+                    </a:xfrm>
+                    <a:prstGeom prst="rect">
+                      <a:avLst/>
+                    </a:prstGeom>
+                  </pic:spPr>
+                </pic:pic>
+              </a:graphicData>
+            </a:graphic>
+          </wp:inline>
+        </w:drawing>
+      </w:r>
+    </w:p>
+    <w:p>
+      <w:pPr>
+        <w:spacing w:after="0"/>
+        <w:ind w:left="360"/>
+        <w:jc w:val="center"/>
+        <w:rPr>
+          <w:rFonts w:ascii="Abadi" w:eastAsia="Abadi" w:hAnsi="Abadi" w:cs="Abadi"/>
+        </w:rPr>
+      </w:pPr>
+      <w:r>
+        <w:rPr>
+          <w:rFonts w:ascii="Abadi" w:eastAsia="Abadi" w:hAnsi="Abadi" w:cs="Abadi"/>
+          <w:i/>
+          <w:iCs/>
+        </w:rPr>
+        <w:t>Demonstrativo de funcionamento</w:t>
+      </w:r>
+      <w:r>
+        <w:rPr>
+          <w:rFonts w:ascii="Abadi" w:eastAsia="Abadi" w:hAnsi="Abadi" w:cs="Abadi"/>
+          <w:i/>
+          <w:iCs/>
+        </w:rPr>
+        <w:t>.</w:t>
+      </w:r>
+    </w:p>
+    <w:p>
+      <w:pPr>
+        <w:spacing w:after="0"/>
+        <w:ind w:left="360"/>
+        <w:jc w:val="center"/>
+        <w:rPr>
+          <w:rFonts w:ascii="Abadi" w:eastAsia="Abadi" w:hAnsi="Abadi" w:cs="Abadi"/>
+        </w:rPr>
+      </w:pPr>
+    </w:p>
+    <w:p>
+      <w:pPr>
+        <w:spacing w:after="0"/>
+        <w:ind w:left="360"/>
+        <w:jc w:val="center"/>
+        <w:rPr>
+          <w:rFonts w:ascii="Abadi" w:eastAsia="Abadi" w:hAnsi="Abadi" w:cs="Abadi"/>
+        </w:rPr>
+      </w:pPr>
+      <w:r>
+        <w:rPr>
+          <w:rFonts w:ascii="Abadi" w:eastAsia="Abadi" w:hAnsi="Abadi" w:cs="Abadi"/>
+        </w:rPr>
+        <w:drawing>
+          <wp:inline distT="0" distB="0" distL="0" distR="0" wp14:anchorId="117DE710" wp14:editId="2615FD06">
+            <wp:extent cx="3911801" cy="1327218"/>
+            <wp:effectExtent l="0" t="0" r="0" b="6350"/>
+            <wp:docPr id="1788497596" name="Picture 1"/>
+            <wp:cNvGraphicFramePr>
+              <a:graphicFrameLocks xmlns:a="http://schemas.openxmlformats.org/drawingml/2006/main" noChangeAspect="1"/>
+            </wp:cNvGraphicFramePr>
+            <a:graphic xmlns:a="http://schemas.openxmlformats.org/drawingml/2006/main">
+              <a:graphicData uri="http://schemas.openxmlformats.org/drawingml/2006/picture">
+                <pic:pic xmlns:pic="http://schemas.openxmlformats.org/drawingml/2006/picture">
+                  <pic:nvPicPr>
+                    <pic:cNvPr id="1788497596" name=""/>
+                    <pic:cNvPicPr/>
+                  </pic:nvPicPr>
+                  <pic:blipFill>
+                    <a:blip r:embed="rId15"/>
+                    <a:stretch>
+                      <a:fillRect/>
+                    </a:stretch>
+                  </pic:blipFill>
+                  <pic:spPr>
+                    <a:xfrm>
+                      <a:off x="0" y="0"/>
+                      <a:ext cx="3911801" cy="1327218"/>
+                    </a:xfrm>
+                    <a:prstGeom prst="rect">
+                      <a:avLst/>
+                    </a:prstGeom>
+                  </pic:spPr>
+                </pic:pic>
+              </a:graphicData>
+            </a:graphic>
+          </wp:inline>
+        </w:drawing>
+      </w:r>
+    </w:p>
+    <w:p>
+      <w:pPr>
+        <w:spacing w:after="0"/>
+        <w:ind w:left="360"/>
+        <w:jc w:val="center"/>
+        <w:rPr>
+          <w:rFonts w:ascii="Abadi" w:eastAsia="Abadi" w:hAnsi="Abadi" w:cs="Abadi"/>
+          <w:i/>
+          <w:iCs/>
+        </w:rPr>
+      </w:pPr>
+      <w:r>
+        <w:rPr>
+          <w:rFonts w:ascii="Abadi" w:eastAsia="Abadi" w:hAnsi="Abadi" w:cs="Abadi"/>
+          <w:i/>
+          <w:iCs/>
+        </w:rPr>
+        <w:t>Demonstrativo da planilha</w:t>
+      </w:r>
+      <w:r>
+        <w:rPr>
+          <w:rFonts w:ascii="Abadi" w:eastAsia="Abadi" w:hAnsi="Abadi" w:cs="Abadi"/>
+          <w:i/>
+          <w:iCs/>
+        </w:rPr>
+        <w:t>.</w:t>
+      </w:r>
+    </w:p>
+    <w:p>
+      <w:pPr>
+        <w:spacing w:after="0"/>
+        <w:ind w:left="360"/>
+        <w:jc w:val="center"/>
+        <w:rPr>
+          <w:rFonts w:ascii="Abadi" w:eastAsia="Abadi" w:hAnsi="Abadi" w:cs="Abadi"/>
           <w:highlight w:val="yellow"/>
         </w:rPr>
-        <w:t>Legenda: [Descrição do indicador de sucesso no upload ou status do LED.]</w:t>
-      </w:r>
+      </w:pPr>
     </w:p>
     <w:p>
       <w:pPr>
@@ -1875,6 +2584,7 @@
         <w:rPr>
           <w:rFonts w:ascii="Abadi" w:eastAsia="Abadi" w:hAnsi="Abadi" w:cs="Abadi"/>
         </w:rPr>
+        <w:lastRenderedPageBreak/>
         <w:t>9. VALIDAÇÃO E COMPARAÇÃO</w:t>
       </w:r>
     </w:p>
@@ -2684,7 +3394,6 @@
               <w:spacing w:after="0"/>
             </w:pPr>
             <w:r>
-              <w:lastRenderedPageBreak/>
               <w:t>Alerta de vazamento constante</w:t>
             </w:r>
           </w:p>
@@ -2918,6 +3627,7 @@
         <w:rPr>
           <w:rFonts w:ascii="Abadi" w:eastAsia="Abadi" w:hAnsi="Abadi" w:cs="Abadi"/>
         </w:rPr>
+        <w:lastRenderedPageBreak/>
         <w:t>11. CONCLUSÃO E PRÓXIMOS PASSOS</w:t>
       </w:r>
     </w:p>
@@ -2929,37 +3639,48 @@
           <w:numId w:val="8"/>
         </w:numPr>
         <w:spacing w:after="0"/>
-        <w:rPr>
-          <w:rFonts w:ascii="Abadi" w:eastAsia="Abadi" w:hAnsi="Abadi" w:cs="Abadi"/>
-          <w:highlight w:val="yellow"/>
-          <w:lang w:val="en-US"/>
-        </w:rPr>
       </w:pPr>
       <w:r>
         <w:rPr>
           <w:rFonts w:ascii="Abadi" w:eastAsia="Abadi" w:hAnsi="Abadi" w:cs="Abadi"/>
           <w:b/>
           <w:bCs/>
-          <w:highlight w:val="yellow"/>
-          <w:lang w:val="en-US"/>
-        </w:rPr>
-        <w:t>Glossário:</w:t>
-      </w:r>
-      <w:r>
-        <w:rPr>
-          <w:rFonts w:ascii="Abadi" w:eastAsia="Abadi" w:hAnsi="Abadi" w:cs="Abadi"/>
-          <w:highlight w:val="yellow"/>
-          <w:lang w:val="en-US"/>
+        </w:rPr>
+        <w:t xml:space="preserve">Desafio </w:t>
+      </w:r>
+      <w:r>
+        <w:rPr>
+          <w:rFonts w:ascii="Abadi" w:eastAsia="Abadi" w:hAnsi="Abadi" w:cs="Abadi"/>
+          <w:b/>
+          <w:bCs/>
+        </w:rPr>
+        <w:t>de Aprimoramento/Expansão</w:t>
+      </w:r>
+      <w:r>
+        <w:rPr>
+          <w:rFonts w:ascii="Abadi" w:eastAsia="Abadi" w:hAnsi="Abadi" w:cs="Abadi"/>
+          <w:b/>
+          <w:bCs/>
+        </w:rPr>
+        <w:t>:</w:t>
+      </w:r>
+      <w:r>
+        <w:rPr>
+          <w:rFonts w:ascii="Abadi" w:eastAsia="Abadi" w:hAnsi="Abadi" w:cs="Abadi"/>
         </w:rPr>
         <w:t xml:space="preserve"> </w:t>
       </w:r>
       <w:r>
         <w:rPr>
           <w:rFonts w:ascii="Abadi" w:eastAsia="Abadi" w:hAnsi="Abadi" w:cs="Abadi"/>
-          <w:highlight w:val="yellow"/>
-          <w:lang w:val="en-US"/>
-        </w:rPr>
-        <w:t>SPI, I2C, SNTP, UID, Webhook, URL Encoding</w:t>
+        </w:rPr>
+        <w:t>Crie uma lista de "UIDs Autorizados" em uma struct no código. Se a tag lida não estiver na lista, mostre "ACESSO NEGADO" no OLED e não envie para a planilha</w:t>
+      </w:r>
+      <w:r>
+        <w:rPr>
+          <w:rFonts w:ascii="Abadi" w:eastAsia="Abadi" w:hAnsi="Abadi" w:cs="Abadi"/>
+        </w:rPr>
+        <w:t>.</w:t>
       </w:r>
     </w:p>
     <w:p>
@@ -2970,58 +3691,6 @@
           <w:numId w:val="8"/>
         </w:numPr>
         <w:spacing w:after="0"/>
-      </w:pPr>
-      <w:r>
-        <w:rPr>
-          <w:rFonts w:ascii="Abadi" w:eastAsia="Abadi" w:hAnsi="Abadi" w:cs="Abadi"/>
-          <w:b/>
-          <w:bCs/>
-        </w:rPr>
-        <w:t xml:space="preserve">Desafio </w:t>
-      </w:r>
-      <w:r>
-        <w:rPr>
-          <w:rFonts w:ascii="Abadi" w:eastAsia="Abadi" w:hAnsi="Abadi" w:cs="Abadi"/>
-          <w:b/>
-          <w:bCs/>
-        </w:rPr>
-        <w:t>de Aprimoramento/Expansão</w:t>
-      </w:r>
-      <w:r>
-        <w:rPr>
-          <w:rFonts w:ascii="Abadi" w:eastAsia="Abadi" w:hAnsi="Abadi" w:cs="Abadi"/>
-          <w:b/>
-          <w:bCs/>
-        </w:rPr>
-        <w:t>:</w:t>
-      </w:r>
-      <w:r>
-        <w:rPr>
-          <w:rFonts w:ascii="Abadi" w:eastAsia="Abadi" w:hAnsi="Abadi" w:cs="Abadi"/>
-        </w:rPr>
-        <w:t xml:space="preserve"> </w:t>
-      </w:r>
-      <w:r>
-        <w:rPr>
-          <w:rFonts w:ascii="Abadi" w:eastAsia="Abadi" w:hAnsi="Abadi" w:cs="Abadi"/>
-        </w:rPr>
-        <w:t>Crie uma lista de "UIDs Autorizados" em uma struct no código. Se a tag lida não estiver na lista, mostre "ACESSO NEGADO" no OLED e não envie para a planilha</w:t>
-      </w:r>
-      <w:r>
-        <w:rPr>
-          <w:rFonts w:ascii="Abadi" w:eastAsia="Abadi" w:hAnsi="Abadi" w:cs="Abadi"/>
-        </w:rPr>
-        <w:t>.</w:t>
-      </w:r>
-    </w:p>
-    <w:p>
-      <w:pPr>
-        <w:pStyle w:val="ListParagraph"/>
-        <w:numPr>
-          <w:ilvl w:val="0"/>
-          <w:numId w:val="8"/>
-        </w:numPr>
-        <w:spacing w:after="0"/>
         <w:rPr>
           <w:rFonts w:ascii="Abadi" w:eastAsia="Abadi" w:hAnsi="Abadi" w:cs="Abadi"/>
         </w:rPr>
@@ -3079,7 +3748,7 @@
         <w:rPr>
           <w:rFonts w:ascii="Abadi" w:eastAsia="Abadi" w:hAnsi="Abadi" w:cs="Abadi"/>
         </w:rPr>
-        <w:t>https://www.google.com/search?q=https://docs.espressif.com/projects/esp-idf/en/latest/esp32/api-reference/protocols/esp_http_client.html</w:t>
+        <w:t>https://docs.espressif.com/projects/esp-idf/en/latest/esp32/api-reference/protocols/esp_http_client.html</w:t>
       </w:r>
       <w:r>
         <w:rPr>
@@ -3521,10 +4190,10 @@
       </w:pPr>
     </w:p>
     <w:sectPr>
-      <w:headerReference w:type="default" r:id="rId11"/>
-      <w:footerReference w:type="default" r:id="rId12"/>
-      <w:headerReference w:type="first" r:id="rId13"/>
-      <w:footerReference w:type="first" r:id="rId14"/>
+      <w:headerReference w:type="default" r:id="rId16"/>
+      <w:footerReference w:type="default" r:id="rId17"/>
+      <w:headerReference w:type="first" r:id="rId18"/>
+      <w:footerReference w:type="first" r:id="rId19"/>
       <w:pgSz w:w="11906" w:h="16838"/>
       <w:pgMar w:top="1440" w:right="1080" w:bottom="1440" w:left="1080" w:header="737" w:footer="708" w:gutter="0"/>
       <w:cols w:space="708"/>
@@ -4141,7 +4810,7 @@
             </wp:anchor>
           </w:drawing>
         </mc:Choice>
-        <mc:Fallback xmlns:a14="http://schemas.microsoft.com/office/drawing/2010/main" xmlns:pic="http://schemas.openxmlformats.org/drawingml/2006/picture" xmlns:a="http://schemas.openxmlformats.org/drawingml/2006/main">
+        <mc:Fallback xmlns:a="http://schemas.openxmlformats.org/drawingml/2006/main" xmlns:pic="http://schemas.openxmlformats.org/drawingml/2006/picture" xmlns:a14="http://schemas.microsoft.com/office/drawing/2010/main">
           <w:pict>
             <v:rect id="Rectangle 4" style="position:absolute;margin-left:0;margin-top:-37pt;width:600.25pt;height:71.95pt;z-index:251664384;visibility:visible;mso-wrap-style:square;mso-width-percent:0;mso-height-percent:0;mso-wrap-distance-left:9pt;mso-wrap-distance-top:0;mso-wrap-distance-right:9pt;mso-wrap-distance-bottom:0;mso-position-horizontal:left;mso-position-horizontal-relative:page;mso-position-vertical:absolute;mso-position-vertical-relative:text;mso-width-percent:0;mso-height-percent:0;mso-width-relative:margin;mso-height-relative:margin;v-text-anchor:middle" o:spid="_x0000_s1026" fillcolor="#01093a [3204]" stroked="f" strokeweight="2pt" w14:anchorId="42279ACB" o:gfxdata="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">
               <w10:wrap anchorx="page"/>
@@ -13062,6 +13731,18 @@
       </w:tcPr>
     </w:tblStylePr>
   </w:style>
+  <w:style w:type="character" w:styleId="UnresolvedMention">
+    <w:name w:val="Unresolved Mention"/>
+    <w:basedOn w:val="DefaultParagraphFont"/>
+    <w:uiPriority w:val="99"/>
+    <w:semiHidden/>
+    <w:unhideWhenUsed/>
+    <w:rsid w:val="00786303"/>
+    <w:rPr>
+      <w:color w:val="605E5C"/>
+      <w:shd w:val="clear" w:color="auto" w:fill="E1DFDD"/>
+    </w:rPr>
+  </w:style>
 </w:styles>
 </file>
 
@@ -13415,10 +14096,6 @@
 </file>
 
 <file path=customXml/item1.xml><?xml version="1.0" encoding="utf-8"?>
-<b:Sources xmlns:b="http://schemas.openxmlformats.org/officeDocument/2006/bibliography" xmlns="http://schemas.openxmlformats.org/officeDocument/2006/bibliography" SelectedStyle="\APASixthEditionOfficeOnline.xsl" StyleName="APA" Version="6"/>
-</file>
-
-<file path=customXml/item2.xml><?xml version="1.0" encoding="utf-8"?>
 <?mso-contentType ?>
 <FormTemplates xmlns="http://schemas.microsoft.com/sharepoint/v3/contenttype/forms">
   <Display>DocumentLibraryForm</Display>
@@ -13427,7 +14104,22 @@
 </FormTemplates>
 </file>
 
+<file path=customXml/item2.xml><?xml version="1.0" encoding="utf-8"?>
+<b:Sources xmlns:b="http://schemas.openxmlformats.org/officeDocument/2006/bibliography" xmlns="http://schemas.openxmlformats.org/officeDocument/2006/bibliography" SelectedStyle="\APASixthEditionOfficeOnline.xsl" StyleName="APA" Version="6"/>
+</file>
+
 <file path=customXml/item3.xml><?xml version="1.0" encoding="utf-8"?>
+<p:properties xmlns:p="http://schemas.microsoft.com/office/2006/metadata/properties" xmlns:xsi="http://www.w3.org/2001/XMLSchema-instance" xmlns:pc="http://schemas.microsoft.com/office/infopath/2007/PartnerControls">
+  <documentManagement>
+    <lcf76f155ced4ddcb4097134ff3c332f xmlns="0337a55e-6c2c-4d63-b79a-aa3d8c227c1d">
+      <Terms xmlns="http://schemas.microsoft.com/office/infopath/2007/PartnerControls"/>
+    </lcf76f155ced4ddcb4097134ff3c332f>
+    <TaxCatchAll xmlns="2d462126-6299-4b3d-b3f3-d8d80c025600" xsi:nil="true"/>
+  </documentManagement>
+</p:properties>
+</file>
+
+<file path=customXml/item4.xml><?xml version="1.0" encoding="utf-8"?>
 <ct:contentTypeSchema xmlns:ct="http://schemas.microsoft.com/office/2006/metadata/contentType" xmlns:ma="http://schemas.microsoft.com/office/2006/metadata/properties/metaAttributes" ct:_="" ma:_="" ma:contentTypeName="Document" ma:contentTypeID="0x0101001A9F42900677274DB5EFFFC08FB74ED9" ma:contentTypeVersion="14" ma:contentTypeDescription="Create a new document." ma:contentTypeScope="" ma:versionID="35dc7fea2fe184f47ee26c49ad6d27ed">
   <xsd:schema xmlns:xsd="http://www.w3.org/2001/XMLSchema" xmlns:xs="http://www.w3.org/2001/XMLSchema" xmlns:p="http://schemas.microsoft.com/office/2006/metadata/properties" xmlns:ns2="0337a55e-6c2c-4d63-b79a-aa3d8c227c1d" xmlns:ns3="2d462126-6299-4b3d-b3f3-d8d80c025600" targetNamespace="http://schemas.microsoft.com/office/2006/metadata/properties" ma:root="true" ma:fieldsID="d2e472a24e092181a905a67079d33ac5" ns2:_="" ns3:_="">
     <xsd:import namespace="0337a55e-6c2c-4d63-b79a-aa3d8c227c1d"/>
@@ -13634,18 +14326,15 @@
 </ct:contentTypeSchema>
 </file>
 
-<file path=customXml/item4.xml><?xml version="1.0" encoding="utf-8"?>
-<p:properties xmlns:p="http://schemas.microsoft.com/office/2006/metadata/properties" xmlns:xsi="http://www.w3.org/2001/XMLSchema-instance" xmlns:pc="http://schemas.microsoft.com/office/infopath/2007/PartnerControls">
-  <documentManagement>
-    <lcf76f155ced4ddcb4097134ff3c332f xmlns="0337a55e-6c2c-4d63-b79a-aa3d8c227c1d">
-      <Terms xmlns="http://schemas.microsoft.com/office/infopath/2007/PartnerControls"/>
-    </lcf76f155ced4ddcb4097134ff3c332f>
-    <TaxCatchAll xmlns="2d462126-6299-4b3d-b3f3-d8d80c025600" xsi:nil="true"/>
-  </documentManagement>
-</p:properties>
+<file path=customXml/itemProps1.xml><?xml version="1.0" encoding="utf-8"?>
+<ds:datastoreItem xmlns:ds="http://schemas.openxmlformats.org/officeDocument/2006/customXml" ds:itemID="{0E62B389-FEAB-4A4A-A22C-F4533FCE1D71}">
+  <ds:schemaRefs>
+    <ds:schemaRef ds:uri="http://schemas.microsoft.com/sharepoint/v3/contenttype/forms"/>
+  </ds:schemaRefs>
+</ds:datastoreItem>
 </file>
 
-<file path=customXml/itemProps1.xml><?xml version="1.0" encoding="utf-8"?>
+<file path=customXml/itemProps2.xml><?xml version="1.0" encoding="utf-8"?>
 <ds:datastoreItem xmlns:ds="http://schemas.openxmlformats.org/officeDocument/2006/customXml" ds:itemID="{878930A0-CBDA-43F7-B5C9-2FBD43FFD8CC}">
   <ds:schemaRefs>
     <ds:schemaRef ds:uri="http://schemas.openxmlformats.org/officeDocument/2006/bibliography"/>
@@ -13653,15 +14342,18 @@
 </ds:datastoreItem>
 </file>
 
-<file path=customXml/itemProps2.xml><?xml version="1.0" encoding="utf-8"?>
-<ds:datastoreItem xmlns:ds="http://schemas.openxmlformats.org/officeDocument/2006/customXml" ds:itemID="{0E62B389-FEAB-4A4A-A22C-F4533FCE1D71}">
+<file path=customXml/itemProps3.xml><?xml version="1.0" encoding="utf-8"?>
+<ds:datastoreItem xmlns:ds="http://schemas.openxmlformats.org/officeDocument/2006/customXml" ds:itemID="{41A70886-D638-4913-811E-25DE943FC343}">
   <ds:schemaRefs>
-    <ds:schemaRef ds:uri="http://schemas.microsoft.com/sharepoint/v3/contenttype/forms"/>
+    <ds:schemaRef ds:uri="http://schemas.microsoft.com/office/2006/metadata/properties"/>
+    <ds:schemaRef ds:uri="http://schemas.microsoft.com/office/infopath/2007/PartnerControls"/>
+    <ds:schemaRef ds:uri="0337a55e-6c2c-4d63-b79a-aa3d8c227c1d"/>
+    <ds:schemaRef ds:uri="2d462126-6299-4b3d-b3f3-d8d80c025600"/>
   </ds:schemaRefs>
 </ds:datastoreItem>
 </file>
 
-<file path=customXml/itemProps3.xml><?xml version="1.0" encoding="utf-8"?>
+<file path=customXml/itemProps4.xml><?xml version="1.0" encoding="utf-8"?>
 <ds:datastoreItem xmlns:ds="http://schemas.openxmlformats.org/officeDocument/2006/customXml" ds:itemID="{8173E8B0-EF27-48B2-99CC-D5706F6DFFFE}">
   <ds:schemaRefs>
     <ds:schemaRef ds:uri="http://schemas.microsoft.com/office/2006/metadata/contentType"/>
@@ -13678,15 +14370,4 @@
     <ds:schemaRef ds:uri="http://schemas.microsoft.com/internal/obd"/>
   </ds:schemaRefs>
 </ds:datastoreItem>
-</file>
-
-<file path=customXml/itemProps4.xml><?xml version="1.0" encoding="utf-8"?>
-<ds:datastoreItem xmlns:ds="http://schemas.openxmlformats.org/officeDocument/2006/customXml" ds:itemID="{41A70886-D638-4913-811E-25DE943FC343}">
-  <ds:schemaRefs>
-    <ds:schemaRef ds:uri="http://schemas.microsoft.com/office/2006/metadata/properties"/>
-    <ds:schemaRef ds:uri="http://schemas.microsoft.com/office/infopath/2007/PartnerControls"/>
-    <ds:schemaRef ds:uri="0337a55e-6c2c-4d63-b79a-aa3d8c227c1d"/>
-    <ds:schemaRef ds:uri="2d462126-6299-4b3d-b3f3-d8d80c025600"/>
-  </ds:schemaRefs>
-</ds:datastoreItem>
 </file>
</xml_diff>